<commit_message>
Changes to time table
</commit_message>
<xml_diff>
--- a/NRHS/Requirements/AI_Instructions.docx
+++ b/NRHS/Requirements/AI_Instructions.docx
@@ -34,25 +34,23 @@
           <w:szCs w:val="22"/>
           <w:lang w:val="en-US"/>
         </w:rPr>
-        <w:t xml:space="preserve"> subject wise. I have attached the excel with name “</w:t>
-      </w:r>
-      <w:proofErr w:type="spellStart"/>
-      <w:r>
-        <w:rPr>
-          <w:sz w:val="22"/>
-          <w:szCs w:val="22"/>
-          <w:lang w:val="en-US"/>
-        </w:rPr>
-        <w:t>NRHS_Information.xlxs</w:t>
-      </w:r>
-      <w:proofErr w:type="spellEnd"/>
-      <w:r>
-        <w:rPr>
-          <w:sz w:val="22"/>
-          <w:szCs w:val="22"/>
-          <w:lang w:val="en-US"/>
-        </w:rPr>
-        <w:t xml:space="preserve"> has 3 spread sheets.</w:t>
+        <w:t xml:space="preserve"> subject wise. I have attached the excel with name “NRHS_Information.xl</w:t>
+      </w:r>
+      <w:r>
+        <w:rPr>
+          <w:sz w:val="22"/>
+          <w:szCs w:val="22"/>
+          <w:lang w:val="en-US"/>
+        </w:rPr>
+        <w:t xml:space="preserve">sx </w:t>
+      </w:r>
+      <w:r>
+        <w:rPr>
+          <w:sz w:val="22"/>
+          <w:szCs w:val="22"/>
+          <w:lang w:val="en-US"/>
+        </w:rPr>
+        <w:t>has 3 spread sheets.</w:t>
       </w:r>
     </w:p>
     <w:p>
@@ -265,25 +263,55 @@
           <w:szCs w:val="22"/>
           <w:lang w:val="en-US"/>
         </w:rPr>
-        <w:t>The teacher allotted to period 1 should take period 8 as a must except for 8, 9 &amp; 10 classes. The period 1 teacher allotment is given in “</w:t>
-      </w:r>
-      <w:proofErr w:type="spellStart"/>
-      <w:r>
-        <w:rPr>
-          <w:sz w:val="22"/>
-          <w:szCs w:val="22"/>
-          <w:lang w:val="en-US"/>
-        </w:rPr>
-        <w:t>NRHS_Information.xlxs</w:t>
-      </w:r>
-      <w:proofErr w:type="spellEnd"/>
-      <w:r>
-        <w:rPr>
-          <w:sz w:val="22"/>
-          <w:szCs w:val="22"/>
-          <w:lang w:val="en-US"/>
-        </w:rPr>
-        <w:t>” document file named as Period 1 teacher allotment.</w:t>
+        <w:t xml:space="preserve">The </w:t>
+      </w:r>
+      <w:r>
+        <w:rPr>
+          <w:sz w:val="22"/>
+          <w:szCs w:val="22"/>
+          <w:lang w:val="en-US"/>
+        </w:rPr>
+        <w:t>Class T</w:t>
+      </w:r>
+      <w:r>
+        <w:rPr>
+          <w:sz w:val="22"/>
+          <w:szCs w:val="22"/>
+          <w:lang w:val="en-US"/>
+        </w:rPr>
+        <w:t xml:space="preserve">eacher </w:t>
+      </w:r>
+      <w:r>
+        <w:rPr>
+          <w:sz w:val="22"/>
+          <w:szCs w:val="22"/>
+          <w:lang w:val="en-US"/>
+        </w:rPr>
+        <w:t xml:space="preserve">&amp; Study Hour </w:t>
+      </w:r>
+      <w:r>
+        <w:rPr>
+          <w:sz w:val="22"/>
+          <w:szCs w:val="22"/>
+          <w:lang w:val="en-US"/>
+        </w:rPr>
+        <w:t>allotment</w:t>
+      </w:r>
+      <w:r>
+        <w:rPr>
+          <w:sz w:val="22"/>
+          <w:szCs w:val="22"/>
+          <w:lang w:val="en-US"/>
+        </w:rPr>
+        <w:t xml:space="preserve"> is mentioned in “NRHS_Information.xlsx” in the spread sheet “Period 1 Teacher Allotment”. Exclude</w:t>
+      </w:r>
+      <w:r>
+        <w:rPr>
+          <w:sz w:val="22"/>
+          <w:szCs w:val="22"/>
+          <w:lang w:val="en-US"/>
+        </w:rPr>
+        <w:t xml:space="preserve"> 8, 9 &amp; 10 classes. </w:t>
       </w:r>
     </w:p>
     <w:p>
@@ -415,7 +443,19 @@
         <w:rPr>
           <w:lang w:val="en-US"/>
         </w:rPr>
-        <w:t>Try to allot leisure for every teacher after 2 to 3 periods.</w:t>
+        <w:t>Ensure not to allot Continue classes for teachers. Allot leisure in between</w:t>
+      </w:r>
+      <w:r>
+        <w:rPr>
+          <w:lang w:val="en-US"/>
+        </w:rPr>
+        <w:t>.</w:t>
+      </w:r>
+      <w:r>
+        <w:rPr>
+          <w:lang w:val="en-US"/>
+        </w:rPr>
+        <w:t xml:space="preserve"> Study Hour is not Counted.</w:t>
       </w:r>
     </w:p>
     <w:p>

</xml_diff>